<commit_message>
fix: Nadia — Primario Presentismo no tiene fecha de cierre del módulo
</commit_message>
<xml_diff>
--- a/public/manuales/Manual_Presentismo_Primario_2026.docx
+++ b/public/manuales/Manual_Presentismo_Primario_2026.docx
@@ -970,7 +970,7 @@
                 <w:sz w:val="18"/>
                 <w:szCs w:val="18"/>
               </w:rPr>
-              <w:t xml:space="preserve">Correcciones excepcionales y registros bloqueados</w:t>
+              <w:t xml:space="preserve">Correcciones excepcionales de registros</w:t>
             </w:r>
           </w:p>
         </w:tc>
@@ -1891,7 +1891,7 @@
           <w:sz w:val="18"/>
           <w:szCs w:val="18"/>
         </w:rPr>
-        <w:t xml:space="preserve">⚠  El presentismo cargado no puede modificarse una vez transcurrido el plazo habilitado, salvo intervención del Directivo o la Dirección de Área.</w:t>
+        <w:t xml:space="preserve">⚠  El Nivel Primario no tiene fecha de cierre del módulo de Presentismo. El docente puede modificar registros en cualquier momento.</w:t>
       </w:r>
     </w:p>
     <w:p>
@@ -3134,7 +3134,7 @@
                 <w:sz w:val="18"/>
                 <w:szCs w:val="18"/>
               </w:rPr>
-              <w:t xml:space="preserve">Sí — dentro del plazo habilitado.</w:t>
+              <w:t xml:space="preserve">Sí — en cualquier momento.</w:t>
             </w:r>
           </w:p>
         </w:tc>
@@ -3197,7 +3197,7 @@
                 <w:sz w:val="18"/>
                 <w:szCs w:val="18"/>
               </w:rPr>
-              <w:t xml:space="preserve">Sí — incluso fuera del plazo estándar.</w:t>
+              <w:t xml:space="preserve">Sí — en cualquier momento.</w:t>
             </w:r>
           </w:p>
         </w:tc>
@@ -3260,7 +3260,7 @@
                 <w:sz w:val="18"/>
                 <w:szCs w:val="18"/>
               </w:rPr>
-              <w:t xml:space="preserve">Sí — para situaciones excepcionales o con período cerrado.</w:t>
+              <w:t xml:space="preserve">Sí — para situaciones excepcionales.</w:t>
             </w:r>
           </w:p>
         </w:tc>
@@ -3454,7 +3454,7 @@
           <w:sz w:val="18"/>
           <w:szCs w:val="18"/>
         </w:rPr>
-        <w:t xml:space="preserve">⚠  Las inasistencias de períodos cerrados solo pueden justificarse con intervención del Directivo o la Dirección de Área.</w:t>
+        <w:t xml:space="preserve">⚠  Las inasistencias pueden justificarse en cualquier momento. El módulo no tiene fecha de cierre.</w:t>
       </w:r>
     </w:p>
     <w:p>
@@ -4812,7 +4812,7 @@
                 <w:sz w:val="18"/>
                 <w:szCs w:val="18"/>
               </w:rPr>
-              <w:t xml:space="preserve">Primera instancia para justificaciones fuera de plazo, configuración de situaciones y comedor.</w:t>
+              <w:t xml:space="preserve">Primera instancia para justificaciones pendientes, configuración de situaciones y comedor.</w:t>
             </w:r>
           </w:p>
         </w:tc>
@@ -4938,7 +4938,7 @@
                 <w:sz w:val="18"/>
                 <w:szCs w:val="18"/>
               </w:rPr>
-              <w:t xml:space="preserve">Corrección de registros bloqueados, errores de FEM, modificación de regularidad.</w:t>
+              <w:t xml:space="preserve">Corrección de registros, errores de FEM, modificación de regularidad.</w:t>
             </w:r>
           </w:p>
         </w:tc>

</xml_diff>

<commit_message>
fix: Nadia — Primario Presentismo elimina solapa Regularidad inexistente, corrige acceso vía ⋮ → Reporte → Histórico-Condición
</commit_message>
<xml_diff>
--- a/public/manuales/Manual_Presentismo_Primario_2026.docx
+++ b/public/manuales/Manual_Presentismo_Primario_2026.docx
@@ -3635,7 +3635,64 @@
           <w:sz w:val="18"/>
           <w:szCs w:val="18"/>
         </w:rPr>
-        <w:t xml:space="preserve">La regularidad se consulta desde la solapa Regularidad dentro del módulo de Presentismo (por sección y bimestre), y también desde el módulo de Matriculados, donde aparece como texto junto a cada alumno: Regular, No regular o Datos insuficientes.</w:t>
+        <w:t xml:space="preserve">La condición de regularidad se consulta desde el módulo de Presentismo de dos formas:</w:t>
+      </w:r>
+    </w:p>
+    <w:p>
+      <w:pPr>
+        <w:pBdr>
+          <w:bottom w:val="single" w:color="073244" w:sz="4" w:space="4"/>
+          <w:left w:val="single" w:color="073244" w:sz="8" w:space="8"/>
+        </w:pBdr>
+        <w:spacing w:after="140" w:before="0"/>
+        <w:ind w:left="360"/>
+      </w:pPr>
+      <w:r>
+        <w:rPr>
+          <w:rFonts w:ascii="Archivo" w:cs="Archivo" w:eastAsia="Archivo" w:hAnsi="Archivo"/>
+          <w:color w:val="333333"/>
+          <w:sz w:val="18"/>
+          <w:szCs w:val="18"/>
+        </w:rPr>
+        <w:t xml:space="preserve">1. En el resumen del estudiante aparece el campo “Condición” con el estado actual.</w:t>
+      </w:r>
+    </w:p>
+    <w:p>
+      <w:pPr>
+        <w:pBdr>
+          <w:bottom w:val="single" w:color="073244" w:sz="4" w:space="4"/>
+          <w:left w:val="single" w:color="073244" w:sz="8" w:space="8"/>
+        </w:pBdr>
+        <w:spacing w:after="140" w:before="0"/>
+        <w:ind w:left="360"/>
+      </w:pPr>
+      <w:r>
+        <w:rPr>
+          <w:rFonts w:ascii="Archivo" w:cs="Archivo" w:eastAsia="Archivo" w:hAnsi="Archivo"/>
+          <w:color w:val="333333"/>
+          <w:sz w:val="18"/>
+          <w:szCs w:val="18"/>
+        </w:rPr>
+        <w:t xml:space="preserve">2. Para ver el histórico por bimestre: en el listado de alumnos, hacé clic en los tres puntos (⋮) del estudiante → seleccioná “Reporte” → en el panel “Histórico - Condición” se muestra la condición bimestre por bimestre.</w:t>
+      </w:r>
+    </w:p>
+    <w:p>
+      <w:pPr>
+        <w:pBdr>
+          <w:bottom w:val="single" w:color="073244" w:sz="4" w:space="4"/>
+          <w:left w:val="single" w:color="073244" w:sz="8" w:space="8"/>
+        </w:pBdr>
+        <w:spacing w:after="140" w:before="0"/>
+        <w:ind w:left="360"/>
+      </w:pPr>
+      <w:r>
+        <w:rPr>
+          <w:rFonts w:ascii="Archivo" w:cs="Archivo" w:eastAsia="Archivo" w:hAnsi="Archivo"/>
+          <w:color w:val="333333"/>
+          <w:sz w:val="18"/>
+          <w:szCs w:val="18"/>
+        </w:rPr>
+        <w:t xml:space="preserve">En Nivel Primario no existe una solapa de Regularidad separada.</w:t>
       </w:r>
     </w:p>
     <w:p>

</xml_diff>

<commit_message>
fix: umbral No regular → más de 5 inasistencias injustificadas (Manual_Presentismo_Primario_2026.docx)
</commit_message>
<xml_diff>
--- a/public/manuales/Manual_Presentismo_Primario_2026.docx
+++ b/public/manuales/Manual_Presentismo_Primario_2026.docx
@@ -3920,7 +3920,7 @@
                 <w:sz w:val="18"/>
                 <w:szCs w:val="18"/>
               </w:rPr>
-              <w:t xml:space="preserve">Superó el límite de inasistencias injustificadas o más del 15% del bimestre.</w:t>
+              <w:t xml:space="preserve">Superó más de 5 inasistencias injustificadas.</w:t>
             </w:r>
           </w:p>
         </w:tc>
@@ -4274,7 +4274,7 @@
                 <w:sz w:val="18"/>
                 <w:szCs w:val="18"/>
               </w:rPr>
-              <w:t xml:space="preserve">Más de 25 inasistencias anuales sin justificar</w:t>
+              <w:t xml:space="preserve">Más de 5 inasistencias injustificadas</w:t>
             </w:r>
           </w:p>
         </w:tc>
@@ -4366,7 +4366,7 @@
                 <w:sz w:val="18"/>
                 <w:szCs w:val="18"/>
               </w:rPr>
-              <w:t xml:space="preserve">Más del 15% de inasistencias en el bimestre</w:t>
+              <w:t xml:space="preserve">Más de 5 inasistencias injustificadas</w:t>
             </w:r>
           </w:p>
         </w:tc>

</xml_diff>

<commit_message>
fix: tabla Prioridad — columna ancha + fila duplicada eliminada (Manual_Presentismo_Primario_2026.docx)
</commit_message>
<xml_diff>
--- a/public/manuales/Manual_Presentismo_Primario_2026.docx
+++ b/public/manuales/Manual_Presentismo_Primario_2026.docx
@@ -4033,7 +4033,7 @@
         </w:trPr>
         <w:tc>
           <w:tcPr>
-            <w:tcW w:type="dxa" w:w="900"/>
+            <w:tcW w:type="dxa" w:w="1400"/>
             <w:tcBorders>
               <w:top w:val="single" w:color="073244" w:sz="1"/>
               <w:left w:val="single" w:color="073244" w:sz="1"/>
@@ -4064,7 +4064,7 @@
         </w:tc>
         <w:tc>
           <w:tcPr>
-            <w:tcW w:type="dxa" w:w="4200"/>
+            <w:tcW w:type="dxa" w:w="3700"/>
             <w:tcBorders>
               <w:top w:val="single" w:color="073244" w:sz="1"/>
               <w:left w:val="single" w:color="073244" w:sz="1"/>
@@ -4128,7 +4128,7 @@
       <w:tr>
         <w:tc>
           <w:tcPr>
-            <w:tcW w:type="dxa" w:w="900"/>
+            <w:tcW w:type="dxa" w:w="1400"/>
             <w:tcBorders>
               <w:top w:val="single" w:color="CCCCCC" w:sz="1"/>
               <w:left w:val="single" w:color="CCCCCC" w:sz="1"/>
@@ -4158,7 +4158,7 @@
         </w:tc>
         <w:tc>
           <w:tcPr>
-            <w:tcW w:type="dxa" w:w="4200"/>
+            <w:tcW w:type="dxa" w:w="3700"/>
             <w:tcBorders>
               <w:top w:val="single" w:color="CCCCCC" w:sz="1"/>
               <w:left w:val="single" w:color="CCCCCC" w:sz="1"/>
@@ -4220,7 +4220,7 @@
       <w:tr>
         <w:tc>
           <w:tcPr>
-            <w:tcW w:type="dxa" w:w="900"/>
+            <w:tcW w:type="dxa" w:w="1400"/>
             <w:tcBorders>
               <w:top w:val="single" w:color="CCCCCC" w:sz="1"/>
               <w:left w:val="single" w:color="CCCCCC" w:sz="1"/>
@@ -4250,7 +4250,7 @@
         </w:tc>
         <w:tc>
           <w:tcPr>
-            <w:tcW w:type="dxa" w:w="4200"/>
+            <w:tcW w:type="dxa" w:w="3700"/>
             <w:tcBorders>
               <w:top w:val="single" w:color="CCCCCC" w:sz="1"/>
               <w:left w:val="single" w:color="CCCCCC" w:sz="1"/>
@@ -4312,7 +4312,7 @@
       <w:tr>
         <w:tc>
           <w:tcPr>
-            <w:tcW w:type="dxa" w:w="900"/>
+            <w:tcW w:type="dxa" w:w="1400"/>
             <w:tcBorders>
               <w:top w:val="single" w:color="CCCCCC" w:sz="1"/>
               <w:left w:val="single" w:color="CCCCCC" w:sz="1"/>
@@ -4336,13 +4336,13 @@
                 <w:sz w:val="18"/>
                 <w:szCs w:val="18"/>
               </w:rPr>
-              <w:t xml:space="preserve">3°</w:t>
-            </w:r>
-          </w:p>
-        </w:tc>
-        <w:tc>
-          <w:tcPr>
-            <w:tcW w:type="dxa" w:w="4200"/>
+              <w:t xml:space="preserve">4°</w:t>
+            </w:r>
+          </w:p>
+        </w:tc>
+        <w:tc>
+          <w:tcPr>
+            <w:tcW w:type="dxa" w:w="3700"/>
             <w:tcBorders>
               <w:top w:val="single" w:color="CCCCCC" w:sz="1"/>
               <w:left w:val="single" w:color="CCCCCC" w:sz="1"/>
@@ -4366,7 +4366,7 @@
                 <w:sz w:val="18"/>
                 <w:szCs w:val="18"/>
               </w:rPr>
-              <w:t xml:space="preserve">Más de 5 inasistencias injustificadas</w:t>
+              <w:t xml:space="preserve">Datos insuficientes para calcular</w:t>
             </w:r>
           </w:p>
         </w:tc>
@@ -4396,7 +4396,7 @@
                 <w:sz w:val="18"/>
                 <w:szCs w:val="18"/>
               </w:rPr>
-              <w:t xml:space="preserve">No regular</w:t>
+              <w:t xml:space="preserve">Datos insuficientes</w:t>
             </w:r>
           </w:p>
         </w:tc>
@@ -4404,7 +4404,7 @@
       <w:tr>
         <w:tc>
           <w:tcPr>
-            <w:tcW w:type="dxa" w:w="900"/>
+            <w:tcW w:type="dxa" w:w="1400"/>
             <w:tcBorders>
               <w:top w:val="single" w:color="CCCCCC" w:sz="1"/>
               <w:left w:val="single" w:color="CCCCCC" w:sz="1"/>
@@ -4428,105 +4428,13 @@
                 <w:sz w:val="18"/>
                 <w:szCs w:val="18"/>
               </w:rPr>
-              <w:t xml:space="preserve">4°</w:t>
-            </w:r>
-          </w:p>
-        </w:tc>
-        <w:tc>
-          <w:tcPr>
-            <w:tcW w:type="dxa" w:w="4200"/>
-            <w:tcBorders>
-              <w:top w:val="single" w:color="CCCCCC" w:sz="1"/>
-              <w:left w:val="single" w:color="CCCCCC" w:sz="1"/>
-              <w:bottom w:val="single" w:color="CCCCCC" w:sz="1"/>
-              <w:right w:val="single" w:color="CCCCCC" w:sz="1"/>
-            </w:tcBorders>
-            <w:tcMar>
-              <w:top w:type="dxa" w:w="80"/>
-              <w:left w:type="dxa" w:w="120"/>
-              <w:bottom w:type="dxa" w:w="80"/>
-              <w:right w:type="dxa" w:w="120"/>
-            </w:tcMar>
-          </w:tcPr>
-          <w:p>
-            <w:r>
-              <w:rPr>
-                <w:rFonts w:ascii="Archivo" w:cs="Archivo" w:eastAsia="Archivo" w:hAnsi="Archivo"/>
-                <w:b w:val="false"/>
-                <w:bCs w:val="false"/>
-                <w:color w:val="222222"/>
-                <w:sz w:val="18"/>
-                <w:szCs w:val="18"/>
-              </w:rPr>
-              <w:t xml:space="preserve">Datos insuficientes para calcular</w:t>
-            </w:r>
-          </w:p>
-        </w:tc>
-        <w:tc>
-          <w:tcPr>
-            <w:tcW w:type="dxa" w:w="4926"/>
-            <w:tcBorders>
-              <w:top w:val="single" w:color="CCCCCC" w:sz="1"/>
-              <w:left w:val="single" w:color="CCCCCC" w:sz="1"/>
-              <w:bottom w:val="single" w:color="CCCCCC" w:sz="1"/>
-              <w:right w:val="single" w:color="CCCCCC" w:sz="1"/>
-            </w:tcBorders>
-            <w:tcMar>
-              <w:top w:type="dxa" w:w="80"/>
-              <w:left w:type="dxa" w:w="120"/>
-              <w:bottom w:type="dxa" w:w="80"/>
-              <w:right w:type="dxa" w:w="120"/>
-            </w:tcMar>
-          </w:tcPr>
-          <w:p>
-            <w:r>
-              <w:rPr>
-                <w:rFonts w:ascii="Archivo" w:cs="Archivo" w:eastAsia="Archivo" w:hAnsi="Archivo"/>
-                <w:b w:val="false"/>
-                <w:bCs w:val="false"/>
-                <w:color w:val="222222"/>
-                <w:sz w:val="18"/>
-                <w:szCs w:val="18"/>
-              </w:rPr>
-              <w:t xml:space="preserve">Datos insuficientes</w:t>
-            </w:r>
-          </w:p>
-        </w:tc>
-      </w:tr>
-      <w:tr>
-        <w:tc>
-          <w:tcPr>
-            <w:tcW w:type="dxa" w:w="900"/>
-            <w:tcBorders>
-              <w:top w:val="single" w:color="CCCCCC" w:sz="1"/>
-              <w:left w:val="single" w:color="CCCCCC" w:sz="1"/>
-              <w:bottom w:val="single" w:color="CCCCCC" w:sz="1"/>
-              <w:right w:val="single" w:color="CCCCCC" w:sz="1"/>
-            </w:tcBorders>
-            <w:tcMar>
-              <w:top w:type="dxa" w:w="80"/>
-              <w:left w:type="dxa" w:w="120"/>
-              <w:bottom w:type="dxa" w:w="80"/>
-              <w:right w:type="dxa" w:w="120"/>
-            </w:tcMar>
-          </w:tcPr>
-          <w:p>
-            <w:r>
-              <w:rPr>
-                <w:rFonts w:ascii="Archivo" w:cs="Archivo" w:eastAsia="Archivo" w:hAnsi="Archivo"/>
-                <w:b/>
-                <w:bCs/>
-                <w:color w:val="222222"/>
-                <w:sz w:val="18"/>
-                <w:szCs w:val="18"/>
-              </w:rPr>
               <w:t xml:space="preserve">5°</w:t>
             </w:r>
           </w:p>
         </w:tc>
         <w:tc>
           <w:tcPr>
-            <w:tcW w:type="dxa" w:w="4200"/>
+            <w:tcW w:type="dxa" w:w="3700"/>
             <w:tcBorders>
               <w:top w:val="single" w:color="CCCCCC" w:sz="1"/>
               <w:left w:val="single" w:color="CCCCCC" w:sz="1"/>

</xml_diff>

<commit_message>
fix: tblGrid + renumeración 6.2 (Manual_Presentismo_Primario_2026.docx)
</commit_message>
<xml_diff>
--- a/public/manuales/Manual_Presentismo_Primario_2026.docx
+++ b/public/manuales/Manual_Presentismo_Primario_2026.docx
@@ -4023,8 +4023,8 @@
         </w:tblBorders>
       </w:tblPr>
       <w:tblGrid>
-        <w:gridCol w:w="900"/>
-        <w:gridCol w:w="4200"/>
+        <w:gridCol w:w="1400"/>
+        <w:gridCol w:w="3700"/>
         <w:gridCol w:w="4926"/>
       </w:tblGrid>
       <w:tr>
@@ -4336,7 +4336,7 @@
                 <w:sz w:val="18"/>
                 <w:szCs w:val="18"/>
               </w:rPr>
-              <w:t xml:space="preserve">4°</w:t>
+              <w:t xml:space="preserve">3°</w:t>
             </w:r>
           </w:p>
         </w:tc>
@@ -4428,7 +4428,7 @@
                 <w:sz w:val="18"/>
                 <w:szCs w:val="18"/>
               </w:rPr>
-              <w:t xml:space="preserve">5°</w:t>
+              <w:t xml:space="preserve">4°</w:t>
             </w:r>
           </w:p>
         </w:tc>

</xml_diff>

<commit_message>
fix: eliminar columna 'Cuenta para regularidad' (Manual_Presentismo_Primario_2026.docx)
</commit_message>
<xml_diff>
--- a/public/manuales/Manual_Presentismo_Primario_2026.docx
+++ b/public/manuales/Manual_Presentismo_Primario_2026.docx
@@ -1277,7 +1277,6 @@
       <w:tblGrid>
         <w:gridCol w:w="2200"/>
         <w:gridCol w:w="4326"/>
-        <w:gridCol w:w="2500"/>
       </w:tblGrid>
       <w:tr>
         <w:trPr>
@@ -1345,37 +1344,6 @@
             </w:r>
           </w:p>
         </w:tc>
-        <w:tc>
-          <w:tcPr>
-            <w:tcW w:type="dxa" w:w="2500"/>
-            <w:tcBorders>
-              <w:top w:val="single" w:color="073244" w:sz="1"/>
-              <w:left w:val="single" w:color="073244" w:sz="1"/>
-              <w:bottom w:val="single" w:color="073244" w:sz="1"/>
-              <w:right w:val="single" w:color="073244" w:sz="1"/>
-            </w:tcBorders>
-            <w:shd w:fill="073244" w:color="auto" w:val="clear"/>
-            <w:tcMar>
-              <w:top w:type="dxa" w:w="80"/>
-              <w:left w:type="dxa" w:w="120"/>
-              <w:bottom w:type="dxa" w:w="80"/>
-              <w:right w:type="dxa" w:w="120"/>
-            </w:tcMar>
-          </w:tcPr>
-          <w:p>
-            <w:r>
-              <w:rPr>
-                <w:rFonts w:ascii="Archivo" w:cs="Archivo" w:eastAsia="Archivo" w:hAnsi="Archivo"/>
-                <w:b/>
-                <w:bCs/>
-                <w:color w:val="FFFFFF"/>
-                <w:sz w:val="18"/>
-                <w:szCs w:val="18"/>
-              </w:rPr>
-              <w:t xml:space="preserve">Cuenta para regularidad</w:t>
-            </w:r>
-          </w:p>
-        </w:tc>
       </w:tr>
       <w:tr>
         <w:tc>
@@ -1439,15 +1407,18 @@
             </w:r>
           </w:p>
         </w:tc>
-        <w:tc>
-          <w:tcPr>
-            <w:tcW w:type="dxa" w:w="2500"/>
-            <w:tcBorders>
-              <w:top w:val="single" w:color="CCCCCC" w:sz="1"/>
-              <w:left w:val="single" w:color="CCCCCC" w:sz="1"/>
-              <w:bottom w:val="single" w:color="CCCCCC" w:sz="1"/>
-              <w:right w:val="single" w:color="CCCCCC" w:sz="1"/>
-            </w:tcBorders>
+      </w:tr>
+      <w:tr>
+        <w:tc>
+          <w:tcPr>
+            <w:tcW w:type="dxa" w:w="2200"/>
+            <w:tcBorders>
+              <w:top w:val="single" w:color="CCCCCC" w:sz="1"/>
+              <w:left w:val="single" w:color="CCCCCC" w:sz="1"/>
+              <w:bottom w:val="single" w:color="CCCCCC" w:sz="1"/>
+              <w:right w:val="single" w:color="CCCCCC" w:sz="1"/>
+            </w:tcBorders>
+            <w:shd w:fill="FFECEC" w:color="auto" w:val="clear"/>
             <w:tcMar>
               <w:top w:type="dxa" w:w="80"/>
               <w:left w:type="dxa" w:w="120"/>
@@ -1465,7 +1436,37 @@
                 <w:sz w:val="18"/>
                 <w:szCs w:val="18"/>
               </w:rPr>
-              <w:t xml:space="preserve">No</w:t>
+              <w:t xml:space="preserve">Ausente</w:t>
+            </w:r>
+          </w:p>
+        </w:tc>
+        <w:tc>
+          <w:tcPr>
+            <w:tcW w:type="dxa" w:w="4326"/>
+            <w:tcBorders>
+              <w:top w:val="single" w:color="CCCCCC" w:sz="1"/>
+              <w:left w:val="single" w:color="CCCCCC" w:sz="1"/>
+              <w:bottom w:val="single" w:color="CCCCCC" w:sz="1"/>
+              <w:right w:val="single" w:color="CCCCCC" w:sz="1"/>
+            </w:tcBorders>
+            <w:tcMar>
+              <w:top w:type="dxa" w:w="80"/>
+              <w:left w:type="dxa" w:w="120"/>
+              <w:bottom w:type="dxa" w:w="80"/>
+              <w:right w:type="dxa" w:w="120"/>
+            </w:tcMar>
+          </w:tcPr>
+          <w:p>
+            <w:r>
+              <w:rPr>
+                <w:rFonts w:ascii="Archivo" w:cs="Archivo" w:eastAsia="Archivo" w:hAnsi="Archivo"/>
+                <w:b w:val="false"/>
+                <w:bCs w:val="false"/>
+                <w:color w:val="222222"/>
+                <w:sz w:val="18"/>
+                <w:szCs w:val="18"/>
+              </w:rPr>
+              <w:t xml:space="preserve">No asistió. Se computa como inasistencia si no se justifica.</w:t>
             </w:r>
           </w:p>
         </w:tc>
@@ -1480,7 +1481,7 @@
               <w:bottom w:val="single" w:color="CCCCCC" w:sz="1"/>
               <w:right w:val="single" w:color="CCCCCC" w:sz="1"/>
             </w:tcBorders>
-            <w:shd w:fill="FFECEC" w:color="auto" w:val="clear"/>
+            <w:shd w:fill="FFF3E0" w:color="auto" w:val="clear"/>
             <w:tcMar>
               <w:top w:type="dxa" w:w="80"/>
               <w:left w:type="dxa" w:w="120"/>
@@ -1498,7 +1499,7 @@
                 <w:sz w:val="18"/>
                 <w:szCs w:val="18"/>
               </w:rPr>
-              <w:t xml:space="preserve">Ausente</w:t>
+              <w:t xml:space="preserve">Media jornada</w:t>
             </w:r>
           </w:p>
         </w:tc>
@@ -1528,19 +1529,22 @@
                 <w:sz w:val="18"/>
                 <w:szCs w:val="18"/>
               </w:rPr>
-              <w:t xml:space="preserve">No asistió. Se computa como inasistencia si no se justifica.</w:t>
-            </w:r>
-          </w:p>
-        </w:tc>
-        <w:tc>
-          <w:tcPr>
-            <w:tcW w:type="dxa" w:w="2500"/>
-            <w:tcBorders>
-              <w:top w:val="single" w:color="CCCCCC" w:sz="1"/>
-              <w:left w:val="single" w:color="CCCCCC" w:sz="1"/>
-              <w:bottom w:val="single" w:color="CCCCCC" w:sz="1"/>
-              <w:right w:val="single" w:color="CCCCCC" w:sz="1"/>
-            </w:tcBorders>
+              <w:t xml:space="preserve">Asistió parcialmente.</w:t>
+            </w:r>
+          </w:p>
+        </w:tc>
+      </w:tr>
+      <w:tr>
+        <w:tc>
+          <w:tcPr>
+            <w:tcW w:type="dxa" w:w="2200"/>
+            <w:tcBorders>
+              <w:top w:val="single" w:color="CCCCCC" w:sz="1"/>
+              <w:left w:val="single" w:color="CCCCCC" w:sz="1"/>
+              <w:bottom w:val="single" w:color="CCCCCC" w:sz="1"/>
+              <w:right w:val="single" w:color="CCCCCC" w:sz="1"/>
+            </w:tcBorders>
+            <w:shd w:fill="F3E5F5" w:color="auto" w:val="clear"/>
             <w:tcMar>
               <w:top w:type="dxa" w:w="80"/>
               <w:left w:type="dxa" w:w="120"/>
@@ -1558,7 +1562,37 @@
                 <w:sz w:val="18"/>
                 <w:szCs w:val="18"/>
               </w:rPr>
-              <w:t xml:space="preserve">Sí (sin justificar)</w:t>
+              <w:t xml:space="preserve">Llegada tarde</w:t>
+            </w:r>
+          </w:p>
+        </w:tc>
+        <w:tc>
+          <w:tcPr>
+            <w:tcW w:type="dxa" w:w="4326"/>
+            <w:tcBorders>
+              <w:top w:val="single" w:color="CCCCCC" w:sz="1"/>
+              <w:left w:val="single" w:color="CCCCCC" w:sz="1"/>
+              <w:bottom w:val="single" w:color="CCCCCC" w:sz="1"/>
+              <w:right w:val="single" w:color="CCCCCC" w:sz="1"/>
+            </w:tcBorders>
+            <w:tcMar>
+              <w:top w:type="dxa" w:w="80"/>
+              <w:left w:type="dxa" w:w="120"/>
+              <w:bottom w:type="dxa" w:w="80"/>
+              <w:right w:type="dxa" w:w="120"/>
+            </w:tcMar>
+          </w:tcPr>
+          <w:p>
+            <w:r>
+              <w:rPr>
+                <w:rFonts w:ascii="Archivo" w:cs="Archivo" w:eastAsia="Archivo" w:hAnsi="Archivo"/>
+                <w:b w:val="false"/>
+                <w:bCs w:val="false"/>
+                <w:color w:val="222222"/>
+                <w:sz w:val="18"/>
+                <w:szCs w:val="18"/>
+              </w:rPr>
+              <w:t xml:space="preserve">Ingresó fuera del horario establecido.</w:t>
             </w:r>
           </w:p>
         </w:tc>
@@ -1573,7 +1607,7 @@
               <w:bottom w:val="single" w:color="CCCCCC" w:sz="1"/>
               <w:right w:val="single" w:color="CCCCCC" w:sz="1"/>
             </w:tcBorders>
-            <w:shd w:fill="FFF3E0" w:color="auto" w:val="clear"/>
+            <w:shd w:fill="F5F5F5" w:color="auto" w:val="clear"/>
             <w:tcMar>
               <w:top w:type="dxa" w:w="80"/>
               <w:left w:type="dxa" w:w="120"/>
@@ -1591,7 +1625,7 @@
                 <w:sz w:val="18"/>
                 <w:szCs w:val="18"/>
               </w:rPr>
-              <w:t xml:space="preserve">Media jornada</w:t>
+              <w:t xml:space="preserve">NC (No Corresponde)</w:t>
             </w:r>
           </w:p>
         </w:tc>
@@ -1621,223 +1655,7 @@
                 <w:sz w:val="18"/>
                 <w:szCs w:val="18"/>
               </w:rPr>
-              <w:t xml:space="preserve">Asistió parcialmente.</w:t>
-            </w:r>
-          </w:p>
-        </w:tc>
-        <w:tc>
-          <w:tcPr>
-            <w:tcW w:type="dxa" w:w="2500"/>
-            <w:tcBorders>
-              <w:top w:val="single" w:color="CCCCCC" w:sz="1"/>
-              <w:left w:val="single" w:color="CCCCCC" w:sz="1"/>
-              <w:bottom w:val="single" w:color="CCCCCC" w:sz="1"/>
-              <w:right w:val="single" w:color="CCCCCC" w:sz="1"/>
-            </w:tcBorders>
-            <w:tcMar>
-              <w:top w:type="dxa" w:w="80"/>
-              <w:left w:type="dxa" w:w="120"/>
-              <w:bottom w:type="dxa" w:w="80"/>
-              <w:right w:type="dxa" w:w="120"/>
-            </w:tcMar>
-          </w:tcPr>
-          <w:p>
-            <w:r>
-              <w:rPr>
-                <w:rFonts w:ascii="Archivo" w:cs="Archivo" w:eastAsia="Archivo" w:hAnsi="Archivo"/>
-                <w:b w:val="false"/>
-                <w:bCs w:val="false"/>
-                <w:color w:val="222222"/>
-                <w:sz w:val="18"/>
-                <w:szCs w:val="18"/>
-              </w:rPr>
-              <w:t xml:space="preserve">Media inasistencia</w:t>
-            </w:r>
-          </w:p>
-        </w:tc>
-      </w:tr>
-      <w:tr>
-        <w:tc>
-          <w:tcPr>
-            <w:tcW w:type="dxa" w:w="2200"/>
-            <w:tcBorders>
-              <w:top w:val="single" w:color="CCCCCC" w:sz="1"/>
-              <w:left w:val="single" w:color="CCCCCC" w:sz="1"/>
-              <w:bottom w:val="single" w:color="CCCCCC" w:sz="1"/>
-              <w:right w:val="single" w:color="CCCCCC" w:sz="1"/>
-            </w:tcBorders>
-            <w:shd w:fill="F3E5F5" w:color="auto" w:val="clear"/>
-            <w:tcMar>
-              <w:top w:type="dxa" w:w="80"/>
-              <w:left w:type="dxa" w:w="120"/>
-              <w:bottom w:type="dxa" w:w="80"/>
-              <w:right w:type="dxa" w:w="120"/>
-            </w:tcMar>
-          </w:tcPr>
-          <w:p>
-            <w:r>
-              <w:rPr>
-                <w:rFonts w:ascii="Archivo" w:cs="Archivo" w:eastAsia="Archivo" w:hAnsi="Archivo"/>
-                <w:b w:val="false"/>
-                <w:bCs w:val="false"/>
-                <w:color w:val="222222"/>
-                <w:sz w:val="18"/>
-                <w:szCs w:val="18"/>
-              </w:rPr>
-              <w:t xml:space="preserve">Llegada tarde</w:t>
-            </w:r>
-          </w:p>
-        </w:tc>
-        <w:tc>
-          <w:tcPr>
-            <w:tcW w:type="dxa" w:w="4326"/>
-            <w:tcBorders>
-              <w:top w:val="single" w:color="CCCCCC" w:sz="1"/>
-              <w:left w:val="single" w:color="CCCCCC" w:sz="1"/>
-              <w:bottom w:val="single" w:color="CCCCCC" w:sz="1"/>
-              <w:right w:val="single" w:color="CCCCCC" w:sz="1"/>
-            </w:tcBorders>
-            <w:tcMar>
-              <w:top w:type="dxa" w:w="80"/>
-              <w:left w:type="dxa" w:w="120"/>
-              <w:bottom w:type="dxa" w:w="80"/>
-              <w:right w:type="dxa" w:w="120"/>
-            </w:tcMar>
-          </w:tcPr>
-          <w:p>
-            <w:r>
-              <w:rPr>
-                <w:rFonts w:ascii="Archivo" w:cs="Archivo" w:eastAsia="Archivo" w:hAnsi="Archivo"/>
-                <w:b w:val="false"/>
-                <w:bCs w:val="false"/>
-                <w:color w:val="222222"/>
-                <w:sz w:val="18"/>
-                <w:szCs w:val="18"/>
-              </w:rPr>
-              <w:t xml:space="preserve">Ingresó fuera del horario establecido.</w:t>
-            </w:r>
-          </w:p>
-        </w:tc>
-        <w:tc>
-          <w:tcPr>
-            <w:tcW w:type="dxa" w:w="2500"/>
-            <w:tcBorders>
-              <w:top w:val="single" w:color="CCCCCC" w:sz="1"/>
-              <w:left w:val="single" w:color="CCCCCC" w:sz="1"/>
-              <w:bottom w:val="single" w:color="CCCCCC" w:sz="1"/>
-              <w:right w:val="single" w:color="CCCCCC" w:sz="1"/>
-            </w:tcBorders>
-            <w:tcMar>
-              <w:top w:type="dxa" w:w="80"/>
-              <w:left w:type="dxa" w:w="120"/>
-              <w:bottom w:type="dxa" w:w="80"/>
-              <w:right w:type="dxa" w:w="120"/>
-            </w:tcMar>
-          </w:tcPr>
-          <w:p>
-            <w:r>
-              <w:rPr>
-                <w:rFonts w:ascii="Archivo" w:cs="Archivo" w:eastAsia="Archivo" w:hAnsi="Archivo"/>
-                <w:b w:val="false"/>
-                <w:bCs w:val="false"/>
-                <w:color w:val="222222"/>
-                <w:sz w:val="18"/>
-                <w:szCs w:val="18"/>
-              </w:rPr>
-              <w:t xml:space="preserve">Según configuración</w:t>
-            </w:r>
-          </w:p>
-        </w:tc>
-      </w:tr>
-      <w:tr>
-        <w:tc>
-          <w:tcPr>
-            <w:tcW w:type="dxa" w:w="2200"/>
-            <w:tcBorders>
-              <w:top w:val="single" w:color="CCCCCC" w:sz="1"/>
-              <w:left w:val="single" w:color="CCCCCC" w:sz="1"/>
-              <w:bottom w:val="single" w:color="CCCCCC" w:sz="1"/>
-              <w:right w:val="single" w:color="CCCCCC" w:sz="1"/>
-            </w:tcBorders>
-            <w:shd w:fill="F5F5F5" w:color="auto" w:val="clear"/>
-            <w:tcMar>
-              <w:top w:type="dxa" w:w="80"/>
-              <w:left w:type="dxa" w:w="120"/>
-              <w:bottom w:type="dxa" w:w="80"/>
-              <w:right w:type="dxa" w:w="120"/>
-            </w:tcMar>
-          </w:tcPr>
-          <w:p>
-            <w:r>
-              <w:rPr>
-                <w:rFonts w:ascii="Archivo" w:cs="Archivo" w:eastAsia="Archivo" w:hAnsi="Archivo"/>
-                <w:b w:val="false"/>
-                <w:bCs w:val="false"/>
-                <w:color w:val="222222"/>
-                <w:sz w:val="18"/>
-                <w:szCs w:val="18"/>
-              </w:rPr>
-              <w:t xml:space="preserve">NC (No Corresponde)</w:t>
-            </w:r>
-          </w:p>
-        </w:tc>
-        <w:tc>
-          <w:tcPr>
-            <w:tcW w:type="dxa" w:w="4326"/>
-            <w:tcBorders>
-              <w:top w:val="single" w:color="CCCCCC" w:sz="1"/>
-              <w:left w:val="single" w:color="CCCCCC" w:sz="1"/>
-              <w:bottom w:val="single" w:color="CCCCCC" w:sz="1"/>
-              <w:right w:val="single" w:color="CCCCCC" w:sz="1"/>
-            </w:tcBorders>
-            <w:tcMar>
-              <w:top w:type="dxa" w:w="80"/>
-              <w:left w:type="dxa" w:w="120"/>
-              <w:bottom w:type="dxa" w:w="80"/>
-              <w:right w:type="dxa" w:w="120"/>
-            </w:tcMar>
-          </w:tcPr>
-          <w:p>
-            <w:r>
-              <w:rPr>
-                <w:rFonts w:ascii="Archivo" w:cs="Archivo" w:eastAsia="Archivo" w:hAnsi="Archivo"/>
-                <w:b w:val="false"/>
-                <w:bCs w:val="false"/>
-                <w:color w:val="222222"/>
-                <w:sz w:val="18"/>
-                <w:szCs w:val="18"/>
-              </w:rPr>
               <w:t xml:space="preserve">Uso excepcional: el alumno no está alcanzado por el presentismo en esa fecha.</w:t>
-            </w:r>
-          </w:p>
-        </w:tc>
-        <w:tc>
-          <w:tcPr>
-            <w:tcW w:type="dxa" w:w="2500"/>
-            <w:tcBorders>
-              <w:top w:val="single" w:color="CCCCCC" w:sz="1"/>
-              <w:left w:val="single" w:color="CCCCCC" w:sz="1"/>
-              <w:bottom w:val="single" w:color="CCCCCC" w:sz="1"/>
-              <w:right w:val="single" w:color="CCCCCC" w:sz="1"/>
-            </w:tcBorders>
-            <w:tcMar>
-              <w:top w:type="dxa" w:w="80"/>
-              <w:left w:type="dxa" w:w="120"/>
-              <w:bottom w:type="dxa" w:w="80"/>
-              <w:right w:type="dxa" w:w="120"/>
-            </w:tcMar>
-          </w:tcPr>
-          <w:p>
-            <w:r>
-              <w:rPr>
-                <w:rFonts w:ascii="Archivo" w:cs="Archivo" w:eastAsia="Archivo" w:hAnsi="Archivo"/>
-                <w:b w:val="false"/>
-                <w:bCs w:val="false"/>
-                <w:color w:val="222222"/>
-                <w:sz w:val="18"/>
-                <w:szCs w:val="18"/>
-              </w:rPr>
-              <w:t xml:space="preserve">No computa falta</w:t>
             </w:r>
           </w:p>
         </w:tc>

</xml_diff>

<commit_message>
fix: NC solo Dirección de Área (Manual_Presentismo_Primario_2026.docx)
</commit_message>
<xml_diff>
--- a/public/manuales/Manual_Presentismo_Primario_2026.docx
+++ b/public/manuales/Manual_Presentismo_Primario_2026.docx
@@ -1655,7 +1655,7 @@
                 <w:sz w:val="18"/>
                 <w:szCs w:val="18"/>
               </w:rPr>
-              <w:t xml:space="preserve">Uso excepcional: el alumno no está alcanzado por el presentismo en esa fecha.</w:t>
+              <w:t xml:space="preserve">Uso excepcional: el alumno no está alcanzado por el presentismo en esa fecha. Solo disponible para el rol Dirección de Área.</w:t>
             </w:r>
           </w:p>
         </w:tc>
@@ -2253,7 +2253,7 @@
           <w:sz w:val="20"/>
           <w:szCs w:val="20"/>
         </w:rPr>
-        <w:t xml:space="preserve">Registrar el estado de cada alumno (mismos estados que el turno regular, incluyendo NC).</w:t>
+        <w:t xml:space="preserve">Registrar el estado de cada alumno (mismos estados que el turno regular, incluyendo NC — solo disponible para Dirección de Área).</w:t>
       </w:r>
     </w:p>
     <w:p>

</xml_diff>

<commit_message>
chore: Jesica actualiza Manual Presentismo Primario 2026 (estados 2.2: Presente, Ausente, APC, IT, RI)
</commit_message>
<xml_diff>
--- a/public/manuales/Manual_Presentismo_Primario_2026.docx
+++ b/public/manuales/Manual_Presentismo_Primario_2026.docx
@@ -1403,7 +1403,7 @@
                 <w:sz w:val="18"/>
                 <w:szCs w:val="18"/>
               </w:rPr>
-              <w:t xml:space="preserve">Asistió a la jornada.</w:t>
+              <w:t xml:space="preserve">El alumno asistió a la jornada.</w:t>
             </w:r>
           </w:p>
         </w:tc>
@@ -1418,7 +1418,7 @@
               <w:bottom w:val="single" w:color="CCCCCC" w:sz="1"/>
               <w:right w:val="single" w:color="CCCCCC" w:sz="1"/>
             </w:tcBorders>
-            <w:shd w:fill="FFECEC" w:color="auto" w:val="clear"/>
+            <w:shd w:fill="FDECEA" w:color="auto" w:val="clear"/>
             <w:tcMar>
               <w:top w:type="dxa" w:w="80"/>
               <w:left w:type="dxa" w:w="120"/>
@@ -1466,7 +1466,7 @@
                 <w:sz w:val="18"/>
                 <w:szCs w:val="18"/>
               </w:rPr>
-              <w:t xml:space="preserve">No asistió. Se computa como inasistencia si no se justifica.</w:t>
+              <w:t xml:space="preserve">No asistió. Genera inasistencia si no se justifica.</w:t>
             </w:r>
           </w:p>
         </w:tc>
@@ -1481,7 +1481,7 @@
               <w:bottom w:val="single" w:color="CCCCCC" w:sz="1"/>
               <w:right w:val="single" w:color="CCCCCC" w:sz="1"/>
             </w:tcBorders>
-            <w:shd w:fill="FFF3E0" w:color="auto" w:val="clear"/>
+            <w:shd w:fill="E0F2F1" w:color="auto" w:val="clear"/>
             <w:tcMar>
               <w:top w:type="dxa" w:w="80"/>
               <w:left w:type="dxa" w:w="120"/>
@@ -1499,7 +1499,7 @@
                 <w:sz w:val="18"/>
                 <w:szCs w:val="18"/>
               </w:rPr>
-              <w:t xml:space="preserve">Media jornada</w:t>
+              <w:t xml:space="preserve">APC (Ausente con presencia en clase)</w:t>
             </w:r>
           </w:p>
         </w:tc>
@@ -1529,7 +1529,7 @@
                 <w:sz w:val="18"/>
                 <w:szCs w:val="18"/>
               </w:rPr>
-              <w:t xml:space="preserve">Asistió parcialmente.</w:t>
+              <w:t xml:space="preserve">Ausente con presencia en clase.</w:t>
             </w:r>
           </w:p>
         </w:tc>
@@ -1544,7 +1544,7 @@
               <w:bottom w:val="single" w:color="CCCCCC" w:sz="1"/>
               <w:right w:val="single" w:color="CCCCCC" w:sz="1"/>
             </w:tcBorders>
-            <w:shd w:fill="F3E5F5" w:color="auto" w:val="clear"/>
+            <w:shd w:fill="FFF8E1" w:color="auto" w:val="clear"/>
             <w:tcMar>
               <w:top w:type="dxa" w:w="80"/>
               <w:left w:type="dxa" w:w="120"/>
@@ -1562,7 +1562,7 @@
                 <w:sz w:val="18"/>
                 <w:szCs w:val="18"/>
               </w:rPr>
-              <w:t xml:space="preserve">Llegada tarde</w:t>
+              <w:t xml:space="preserve">IT (Ingreso tardío)</w:t>
             </w:r>
           </w:p>
         </w:tc>
@@ -1607,7 +1607,7 @@
               <w:bottom w:val="single" w:color="CCCCCC" w:sz="1"/>
               <w:right w:val="single" w:color="CCCCCC" w:sz="1"/>
             </w:tcBorders>
-            <w:shd w:fill="F5F5F5" w:color="auto" w:val="clear"/>
+            <w:shd w:fill="F3E5F5" w:color="auto" w:val="clear"/>
             <w:tcMar>
               <w:top w:type="dxa" w:w="80"/>
               <w:left w:type="dxa" w:w="120"/>
@@ -1625,7 +1625,7 @@
                 <w:sz w:val="18"/>
                 <w:szCs w:val="18"/>
               </w:rPr>
-              <w:t xml:space="preserve">NC (No Corresponde)</w:t>
+              <w:t xml:space="preserve">RI (Retiro anticipado)</w:t>
             </w:r>
           </w:p>
         </w:tc>
@@ -1655,7 +1655,7 @@
                 <w:sz w:val="18"/>
                 <w:szCs w:val="18"/>
               </w:rPr>
-              <w:t xml:space="preserve">Uso excepcional: el alumno no está alcanzado por el presentismo en esa fecha. Solo disponible para el rol Dirección de Área.</w:t>
+              <w:t xml:space="preserve">Se retiró fuera del horario establecido.</w:t>
             </w:r>
           </w:p>
         </w:tc>

</xml_diff>